<commit_message>
fix(goreltech): retain pass attendance and align original document signatures
</commit_message>
<xml_diff>
--- a/supabase/functions/_shared/group-doc-templates/goreltech/group-package/v1/templates/attestation_sheet.docx
+++ b/supabase/functions/_shared/group-doc-templates/goreltech/group-package/v1/templates/attestation_sheet.docx
@@ -1248,9 +1248,31 @@
     <w:p>
       <w:pPr>
         <w:pStyle w:val="HTML"/>
+        <w:keepNext/>
         <w:shd w:val="clear" w:color="auto" w:fill="FFFFFF"/>
+        <w:tabs>
+          <w:tab w:val="clear" w:pos="916"/>
+          <w:tab w:val="clear" w:pos="1832"/>
+          <w:tab w:val="clear" w:pos="2748"/>
+          <w:tab w:val="clear" w:pos="3664"/>
+          <w:tab w:val="clear" w:pos="4580"/>
+          <w:tab w:val="center" w:pos="4800"/>
+          <w:tab w:val="clear" w:pos="5496"/>
+          <w:tab w:val="clear" w:pos="6412"/>
+          <w:tab w:val="clear" w:pos="7328"/>
+          <w:tab w:val="center" w:pos="7600"/>
+          <w:tab w:val="clear" w:pos="8244"/>
+          <w:tab w:val="clear" w:pos="9160"/>
+          <w:tab w:val="clear" w:pos="10076"/>
+          <w:tab w:val="clear" w:pos="10992"/>
+          <w:tab w:val="clear" w:pos="11908"/>
+          <w:tab w:val="clear" w:pos="12824"/>
+          <w:tab w:val="clear" w:pos="13740"/>
+          <w:tab w:val="clear" w:pos="14656"/>
+        </w:tabs>
         <w:spacing w:line="276" w:lineRule="auto"/>
-        <w:ind w:left="-993"/>
+        <w:ind w:left="0" w:right="0" w:firstLine="0" w:hanging="0" w:leftChars="0" w:rightChars="0" w:firstLineChars="0" w:hangingChars="0"/>
+        <w:jc w:val="left"/>
         <w:rPr>
           <w:rFonts w:ascii="Times New Roman" w:hAnsi="Times New Roman" w:cs="Times New Roman"/>
           <w:color w:val="000000"/>
@@ -1265,8 +1287,79 @@
           <w:sz w:val="24"/>
           <w:szCs w:val="24"/>
         </w:rPr>
-        <w:t>Подпись преподавателя 1 __________________________ / [[INSTRUCTOR_1_SHORT]] /</w:t>
-      </w:r>
+        <w:t xml:space="preserve">Подпись преподавателя 1</w:t>
+      </w:r>
+      <w:r>
+        <w:rPr>
+          <w:rFonts w:ascii="Times New Roman" w:hAnsi="Times New Roman" w:cs="Times New Roman"/>
+          <w:color w:val="000000"/>
+          <w:sz w:val="24"/>
+          <w:szCs w:val="24"/>
+        </w:rPr>
+        <w:tab/>
+      </w:r>
+      <w:r>
+        <w:rPr>
+          <w:rFonts w:ascii="Times New Roman" w:hAnsi="Times New Roman" w:cs="Times New Roman"/>
+          <w:color w:val="000000"/>
+          <w:sz w:val="24"/>
+          <w:szCs w:val="24"/>
+        </w:rPr>
+        <w:t xml:space="preserve">__________________________</w:t>
+      </w:r>
+      <w:r>
+        <w:rPr>
+          <w:rFonts w:ascii="Times New Roman" w:hAnsi="Times New Roman" w:cs="Times New Roman"/>
+          <w:color w:val="000000"/>
+          <w:sz w:val="24"/>
+          <w:szCs w:val="24"/>
+        </w:rPr>
+        <w:tab/>
+      </w:r>
+      <w:r>
+        <w:rPr>
+          <w:rFonts w:ascii="Times New Roman" w:hAnsi="Times New Roman" w:cs="Times New Roman"/>
+          <w:color w:val="000000"/>
+          <w:sz w:val="24"/>
+          <w:szCs w:val="24"/>
+        </w:rPr>
+        <w:t xml:space="preserve">[[INSTRUCTOR_1_SHORT]]</w:t>
+      </w:r>
+    </w:p>
+    <w:p>
+      <w:pPr>
+        <w:pStyle w:val="HTML"/>
+        <w:shd w:val="clear" w:color="auto" w:fill="FFFFFF"/>
+        <w:tabs>
+          <w:tab w:val="clear" w:pos="916"/>
+          <w:tab w:val="clear" w:pos="1832"/>
+          <w:tab w:val="clear" w:pos="2748"/>
+          <w:tab w:val="clear" w:pos="3664"/>
+          <w:tab w:val="clear" w:pos="4580"/>
+          <w:tab w:val="center" w:pos="4800"/>
+          <w:tab w:val="clear" w:pos="5496"/>
+          <w:tab w:val="clear" w:pos="6412"/>
+          <w:tab w:val="clear" w:pos="7328"/>
+          <w:tab w:val="center" w:pos="7600"/>
+          <w:tab w:val="clear" w:pos="8244"/>
+          <w:tab w:val="clear" w:pos="9160"/>
+          <w:tab w:val="clear" w:pos="10076"/>
+          <w:tab w:val="clear" w:pos="10992"/>
+          <w:tab w:val="clear" w:pos="11908"/>
+          <w:tab w:val="clear" w:pos="12824"/>
+          <w:tab w:val="clear" w:pos="13740"/>
+          <w:tab w:val="clear" w:pos="14656"/>
+        </w:tabs>
+        <w:spacing w:line="276" w:lineRule="auto"/>
+        <w:ind w:left="0" w:right="0" w:firstLine="0" w:hanging="0" w:leftChars="0" w:rightChars="0" w:firstLineChars="0" w:hangingChars="0"/>
+        <w:jc w:val="left"/>
+        <w:rPr>
+          <w:rFonts w:ascii="Times New Roman" w:hAnsi="Times New Roman" w:cs="Times New Roman"/>
+          <w:color w:val="000000"/>
+          <w:sz w:val="24"/>
+          <w:szCs w:val="24"/>
+        </w:rPr>
+      </w:pPr>
       <w:r>
         <w:rPr>
           <w:rFonts w:ascii="Times New Roman" w:hAnsi="Times New Roman" w:cs="Times New Roman"/>
@@ -1283,7 +1376,195 @@
           <w:sz w:val="24"/>
           <w:szCs w:val="24"/>
         </w:rPr>
-        <w:t/>
+        <w:tab/>
+      </w:r>
+      <w:r>
+        <w:rPr>
+          <w:rFonts w:ascii="Times New Roman" w:hAnsi="Times New Roman" w:cs="Times New Roman"/>
+          <w:color w:val="000000"/>
+          <w:sz w:val="24"/>
+          <w:szCs w:val="24"/>
+        </w:rPr>
+        <w:t xml:space="preserve">(подпись)</w:t>
+      </w:r>
+      <w:r>
+        <w:rPr>
+          <w:rFonts w:ascii="Times New Roman" w:hAnsi="Times New Roman" w:cs="Times New Roman"/>
+          <w:color w:val="000000"/>
+          <w:sz w:val="24"/>
+          <w:szCs w:val="24"/>
+        </w:rPr>
+        <w:tab/>
+      </w:r>
+      <w:r>
+        <w:rPr>
+          <w:rFonts w:ascii="Times New Roman" w:hAnsi="Times New Roman" w:cs="Times New Roman"/>
+          <w:color w:val="000000"/>
+          <w:sz w:val="24"/>
+          <w:szCs w:val="24"/>
+        </w:rPr>
+        <w:t xml:space="preserve">(ФИО)</w:t>
+      </w:r>
+    </w:p>
+    <w:p>
+      <w:pPr>
+        <w:pStyle w:val="HTML"/>
+        <w:keepNext/>
+        <w:shd w:val="clear" w:color="auto" w:fill="FFFFFF"/>
+        <w:tabs>
+          <w:tab w:val="clear" w:pos="916"/>
+          <w:tab w:val="clear" w:pos="1832"/>
+          <w:tab w:val="clear" w:pos="2748"/>
+          <w:tab w:val="clear" w:pos="3664"/>
+          <w:tab w:val="clear" w:pos="4580"/>
+          <w:tab w:val="center" w:pos="4800"/>
+          <w:tab w:val="clear" w:pos="5496"/>
+          <w:tab w:val="clear" w:pos="6412"/>
+          <w:tab w:val="clear" w:pos="7328"/>
+          <w:tab w:val="center" w:pos="7600"/>
+          <w:tab w:val="clear" w:pos="8244"/>
+          <w:tab w:val="clear" w:pos="9160"/>
+          <w:tab w:val="clear" w:pos="10076"/>
+          <w:tab w:val="clear" w:pos="10992"/>
+          <w:tab w:val="clear" w:pos="11908"/>
+          <w:tab w:val="clear" w:pos="12824"/>
+          <w:tab w:val="clear" w:pos="13740"/>
+          <w:tab w:val="clear" w:pos="14656"/>
+        </w:tabs>
+        <w:spacing w:line="276" w:lineRule="auto"/>
+        <w:ind w:left="0" w:right="0" w:firstLine="0" w:hanging="0" w:leftChars="0" w:rightChars="0" w:firstLineChars="0" w:hangingChars="0"/>
+        <w:jc w:val="left"/>
+        <w:rPr>
+          <w:rFonts w:ascii="Times New Roman" w:hAnsi="Times New Roman" w:cs="Times New Roman"/>
+          <w:color w:val="000000"/>
+          <w:sz w:val="24"/>
+          <w:szCs w:val="24"/>
+        </w:rPr>
+      </w:pPr>
+      <w:r>
+        <w:rPr>
+          <w:rFonts w:ascii="Times New Roman" w:hAnsi="Times New Roman" w:cs="Times New Roman"/>
+          <w:color w:val="000000"/>
+          <w:sz w:val="24"/>
+          <w:szCs w:val="24"/>
+        </w:rPr>
+        <w:t xml:space="preserve">Подпись преподавателя 2</w:t>
+      </w:r>
+      <w:r>
+        <w:rPr>
+          <w:rFonts w:ascii="Times New Roman" w:hAnsi="Times New Roman" w:cs="Times New Roman"/>
+          <w:color w:val="000000"/>
+          <w:sz w:val="24"/>
+          <w:szCs w:val="24"/>
+        </w:rPr>
+        <w:tab/>
+      </w:r>
+      <w:r>
+        <w:rPr>
+          <w:rFonts w:ascii="Times New Roman" w:hAnsi="Times New Roman" w:cs="Times New Roman"/>
+          <w:color w:val="000000"/>
+          <w:sz w:val="24"/>
+          <w:szCs w:val="24"/>
+        </w:rPr>
+        <w:t xml:space="preserve">__________________________</w:t>
+      </w:r>
+      <w:r>
+        <w:rPr>
+          <w:rFonts w:ascii="Times New Roman" w:hAnsi="Times New Roman" w:cs="Times New Roman"/>
+          <w:color w:val="000000"/>
+          <w:sz w:val="24"/>
+          <w:szCs w:val="24"/>
+        </w:rPr>
+        <w:tab/>
+      </w:r>
+      <w:r>
+        <w:rPr>
+          <w:rFonts w:ascii="Times New Roman" w:hAnsi="Times New Roman" w:cs="Times New Roman"/>
+          <w:color w:val="000000"/>
+          <w:sz w:val="24"/>
+          <w:szCs w:val="24"/>
+        </w:rPr>
+        <w:t xml:space="preserve">[[INSTRUCTOR_2_SHORT]]</w:t>
+      </w:r>
+    </w:p>
+    <w:p>
+      <w:pPr>
+        <w:pStyle w:val="HTML"/>
+        <w:shd w:val="clear" w:color="auto" w:fill="FFFFFF"/>
+        <w:tabs>
+          <w:tab w:val="clear" w:pos="916"/>
+          <w:tab w:val="clear" w:pos="1832"/>
+          <w:tab w:val="clear" w:pos="2748"/>
+          <w:tab w:val="clear" w:pos="3664"/>
+          <w:tab w:val="clear" w:pos="4580"/>
+          <w:tab w:val="center" w:pos="4800"/>
+          <w:tab w:val="clear" w:pos="5496"/>
+          <w:tab w:val="clear" w:pos="6412"/>
+          <w:tab w:val="clear" w:pos="7328"/>
+          <w:tab w:val="center" w:pos="7600"/>
+          <w:tab w:val="clear" w:pos="8244"/>
+          <w:tab w:val="clear" w:pos="9160"/>
+          <w:tab w:val="clear" w:pos="10076"/>
+          <w:tab w:val="clear" w:pos="10992"/>
+          <w:tab w:val="clear" w:pos="11908"/>
+          <w:tab w:val="clear" w:pos="12824"/>
+          <w:tab w:val="clear" w:pos="13740"/>
+          <w:tab w:val="clear" w:pos="14656"/>
+        </w:tabs>
+        <w:spacing w:line="276" w:lineRule="auto"/>
+        <w:ind w:left="0" w:right="0" w:firstLine="0" w:hanging="0" w:leftChars="0" w:rightChars="0" w:firstLineChars="0" w:hangingChars="0"/>
+        <w:jc w:val="left"/>
+        <w:rPr>
+          <w:rFonts w:ascii="Times New Roman" w:hAnsi="Times New Roman" w:cs="Times New Roman"/>
+          <w:color w:val="000000"/>
+          <w:sz w:val="24"/>
+          <w:szCs w:val="24"/>
+        </w:rPr>
+      </w:pPr>
+      <w:r>
+        <w:rPr>
+          <w:rFonts w:ascii="Times New Roman" w:hAnsi="Times New Roman" w:cs="Times New Roman"/>
+          <w:color w:val="000000"/>
+          <w:sz w:val="24"/>
+          <w:szCs w:val="24"/>
+        </w:rPr>
+        <w:t xml:space="preserve"/>
+      </w:r>
+      <w:r>
+        <w:rPr>
+          <w:rFonts w:ascii="Times New Roman" w:hAnsi="Times New Roman" w:cs="Times New Roman"/>
+          <w:color w:val="000000"/>
+          <w:sz w:val="24"/>
+          <w:szCs w:val="24"/>
+        </w:rPr>
+        <w:tab/>
+      </w:r>
+      <w:r>
+        <w:rPr>
+          <w:rFonts w:ascii="Times New Roman" w:hAnsi="Times New Roman" w:cs="Times New Roman"/>
+          <w:color w:val="000000"/>
+          <w:sz w:val="24"/>
+          <w:szCs w:val="24"/>
+        </w:rPr>
+        <w:t xml:space="preserve">(подпись)</w:t>
+      </w:r>
+      <w:r>
+        <w:rPr>
+          <w:rFonts w:ascii="Times New Roman" w:hAnsi="Times New Roman" w:cs="Times New Roman"/>
+          <w:color w:val="000000"/>
+          <w:sz w:val="24"/>
+          <w:szCs w:val="24"/>
+        </w:rPr>
+        <w:tab/>
+      </w:r>
+      <w:r>
+        <w:rPr>
+          <w:rFonts w:ascii="Times New Roman" w:hAnsi="Times New Roman" w:cs="Times New Roman"/>
+          <w:color w:val="000000"/>
+          <w:sz w:val="24"/>
+          <w:szCs w:val="24"/>
+        </w:rPr>
+        <w:t xml:space="preserve">(ФИО)</w:t>
       </w:r>
     </w:p>
     <w:p>
@@ -1299,15 +1580,87 @@
           <w:szCs w:val="24"/>
         </w:rPr>
       </w:pPr>
-      <w:r>
-        <w:rPr>
-          <w:rFonts w:ascii="Times New Roman" w:hAnsi="Times New Roman" w:cs="Times New Roman"/>
-          <w:color w:val="000000"/>
-          <w:sz w:val="24"/>
-          <w:szCs w:val="24"/>
-        </w:rPr>
-        <w:t>Подпись преподавателя 2 __________________________ / [[INSTRUCTOR_2_SHORT]] /</w:t>
-      </w:r>
+    </w:p>
+    <w:p>
+      <w:pPr>
+        <w:pStyle w:val="HTML"/>
+        <w:keepNext/>
+        <w:shd w:val="clear" w:color="auto" w:fill="FFFFFF"/>
+        <w:tabs>
+          <w:tab w:val="clear" w:pos="916"/>
+          <w:tab w:val="clear" w:pos="1832"/>
+          <w:tab w:val="clear" w:pos="2748"/>
+          <w:tab w:val="clear" w:pos="3664"/>
+          <w:tab w:val="clear" w:pos="4580"/>
+          <w:tab w:val="center" w:pos="4800"/>
+          <w:tab w:val="clear" w:pos="5496"/>
+          <w:tab w:val="clear" w:pos="6412"/>
+          <w:tab w:val="clear" w:pos="7328"/>
+          <w:tab w:val="center" w:pos="7600"/>
+          <w:tab w:val="clear" w:pos="8244"/>
+          <w:tab w:val="clear" w:pos="9160"/>
+          <w:tab w:val="clear" w:pos="10076"/>
+          <w:tab w:val="clear" w:pos="10992"/>
+          <w:tab w:val="clear" w:pos="11908"/>
+          <w:tab w:val="clear" w:pos="12824"/>
+          <w:tab w:val="clear" w:pos="13740"/>
+          <w:tab w:val="clear" w:pos="14656"/>
+        </w:tabs>
+        <w:spacing w:line="276" w:lineRule="auto"/>
+        <w:ind w:left="0" w:right="0" w:firstLine="0" w:hanging="0" w:leftChars="0" w:rightChars="0" w:firstLineChars="0" w:hangingChars="0"/>
+        <w:jc w:val="left"/>
+        <w:rPr>
+          <w:rFonts w:ascii="Times New Roman" w:hAnsi="Times New Roman" w:cs="Times New Roman"/>
+          <w:color w:val="000000"/>
+          <w:sz w:val="24"/>
+          <w:szCs w:val="24"/>
+        </w:rPr>
+      </w:pPr>
+      <w:r>
+        <w:rPr>
+          <w:rFonts w:ascii="Times New Roman" w:hAnsi="Times New Roman" w:cs="Times New Roman"/>
+          <w:color w:val="000000"/>
+          <w:sz w:val="24"/>
+          <w:szCs w:val="24"/>
+        </w:rPr>
+        <w:t xml:space="preserve">[[SIGNATORY_POSITION]]</w:t>
+      </w:r>
+    </w:p>
+    <w:p>
+      <w:pPr>
+        <w:pStyle w:val="HTML"/>
+        <w:keepNext/>
+        <w:shd w:val="clear" w:color="auto" w:fill="FFFFFF"/>
+        <w:tabs>
+          <w:tab w:val="clear" w:pos="916"/>
+          <w:tab w:val="clear" w:pos="1832"/>
+          <w:tab w:val="clear" w:pos="2748"/>
+          <w:tab w:val="clear" w:pos="3664"/>
+          <w:tab w:val="clear" w:pos="4580"/>
+          <w:tab w:val="center" w:pos="4800"/>
+          <w:tab w:val="clear" w:pos="5496"/>
+          <w:tab w:val="clear" w:pos="6412"/>
+          <w:tab w:val="clear" w:pos="7328"/>
+          <w:tab w:val="center" w:pos="7600"/>
+          <w:tab w:val="clear" w:pos="8244"/>
+          <w:tab w:val="clear" w:pos="9160"/>
+          <w:tab w:val="clear" w:pos="10076"/>
+          <w:tab w:val="clear" w:pos="10992"/>
+          <w:tab w:val="clear" w:pos="11908"/>
+          <w:tab w:val="clear" w:pos="12824"/>
+          <w:tab w:val="clear" w:pos="13740"/>
+          <w:tab w:val="clear" w:pos="14656"/>
+        </w:tabs>
+        <w:spacing w:line="276" w:lineRule="auto"/>
+        <w:ind w:left="0" w:right="0" w:firstLine="0" w:hanging="0" w:leftChars="0" w:rightChars="0" w:firstLineChars="0" w:hangingChars="0"/>
+        <w:jc w:val="left"/>
+        <w:rPr>
+          <w:rFonts w:ascii="Times New Roman" w:hAnsi="Times New Roman" w:cs="Times New Roman"/>
+          <w:color w:val="000000"/>
+          <w:sz w:val="24"/>
+          <w:szCs w:val="24"/>
+        </w:rPr>
+      </w:pPr>
       <w:r>
         <w:rPr>
           <w:rFonts w:ascii="Times New Roman" w:hAnsi="Times New Roman" w:cs="Times New Roman"/>
@@ -1324,15 +1677,63 @@
           <w:sz w:val="24"/>
           <w:szCs w:val="24"/>
         </w:rPr>
-        <w:t/>
+        <w:tab/>
+      </w:r>
+      <w:r>
+        <w:rPr>
+          <w:rFonts w:ascii="Times New Roman" w:hAnsi="Times New Roman" w:cs="Times New Roman"/>
+          <w:color w:val="000000"/>
+          <w:sz w:val="24"/>
+          <w:szCs w:val="24"/>
+        </w:rPr>
+        <w:t xml:space="preserve">__________________________</w:t>
+      </w:r>
+      <w:r>
+        <w:rPr>
+          <w:rFonts w:ascii="Times New Roman" w:hAnsi="Times New Roman" w:cs="Times New Roman"/>
+          <w:color w:val="000000"/>
+          <w:sz w:val="24"/>
+          <w:szCs w:val="24"/>
+        </w:rPr>
+        <w:tab/>
+      </w:r>
+      <w:r>
+        <w:rPr>
+          <w:rFonts w:ascii="Times New Roman" w:hAnsi="Times New Roman" w:cs="Times New Roman"/>
+          <w:color w:val="000000"/>
+          <w:sz w:val="24"/>
+          <w:szCs w:val="24"/>
+        </w:rPr>
+        <w:t xml:space="preserve">[[SIGNATORY_SHORT]]</w:t>
       </w:r>
     </w:p>
     <w:p>
       <w:pPr>
         <w:pStyle w:val="HTML"/>
         <w:shd w:val="clear" w:color="auto" w:fill="FFFFFF"/>
+        <w:tabs>
+          <w:tab w:val="clear" w:pos="916"/>
+          <w:tab w:val="clear" w:pos="1832"/>
+          <w:tab w:val="clear" w:pos="2748"/>
+          <w:tab w:val="clear" w:pos="3664"/>
+          <w:tab w:val="clear" w:pos="4580"/>
+          <w:tab w:val="center" w:pos="4800"/>
+          <w:tab w:val="clear" w:pos="5496"/>
+          <w:tab w:val="clear" w:pos="6412"/>
+          <w:tab w:val="clear" w:pos="7328"/>
+          <w:tab w:val="center" w:pos="7600"/>
+          <w:tab w:val="clear" w:pos="8244"/>
+          <w:tab w:val="clear" w:pos="9160"/>
+          <w:tab w:val="clear" w:pos="10076"/>
+          <w:tab w:val="clear" w:pos="10992"/>
+          <w:tab w:val="clear" w:pos="11908"/>
+          <w:tab w:val="clear" w:pos="12824"/>
+          <w:tab w:val="clear" w:pos="13740"/>
+          <w:tab w:val="clear" w:pos="14656"/>
+        </w:tabs>
         <w:spacing w:line="276" w:lineRule="auto"/>
-        <w:ind w:left="-993"/>
+        <w:ind w:left="0" w:right="0" w:firstLine="0" w:hanging="0" w:leftChars="0" w:rightChars="0" w:firstLineChars="0" w:hangingChars="0"/>
+        <w:jc w:val="left"/>
         <w:rPr>
           <w:rFonts w:ascii="Times New Roman" w:hAnsi="Times New Roman" w:cs="Times New Roman"/>
           <w:color w:val="000000"/>
@@ -1340,69 +1741,6 @@
           <w:szCs w:val="24"/>
         </w:rPr>
       </w:pPr>
-      <w:r>
-        <w:rPr>
-          <w:rFonts w:ascii="Times New Roman" w:hAnsi="Times New Roman" w:cs="Times New Roman"/>
-          <w:color w:val="000000"/>
-          <w:sz w:val="24"/>
-          <w:szCs w:val="24"/>
-        </w:rPr>
-        <w:t xml:space="preserve">                             </w:t>
-      </w:r>
-      <w:r>
-        <w:rPr>
-          <w:rFonts w:ascii="Times New Roman" w:hAnsi="Times New Roman" w:cs="Times New Roman"/>
-          <w:color w:val="000000"/>
-          <w:sz w:val="24"/>
-          <w:szCs w:val="24"/>
-        </w:rPr>
-        <w:t xml:space="preserve">                  </w:t>
-      </w:r>
-      <w:r>
-        <w:rPr>
-          <w:rFonts w:ascii="Times New Roman" w:hAnsi="Times New Roman" w:cs="Times New Roman"/>
-          <w:color w:val="000000"/>
-          <w:sz w:val="24"/>
-          <w:szCs w:val="24"/>
-        </w:rPr>
-        <w:t xml:space="preserve"> </w:t>
-      </w:r>
-      <w:r>
-        <w:rPr>
-          <w:rFonts w:ascii="Times New Roman" w:hAnsi="Times New Roman" w:cs="Times New Roman"/>
-          <w:color w:val="000000"/>
-          <w:sz w:val="24"/>
-          <w:szCs w:val="24"/>
-        </w:rPr>
-        <w:t xml:space="preserve">                  </w:t>
-      </w:r>
-      <w:r>
-        <w:rPr>
-          <w:rFonts w:ascii="Times New Roman" w:hAnsi="Times New Roman" w:cs="Times New Roman"/>
-          <w:color w:val="000000"/>
-          <w:sz w:val="24"/>
-          <w:szCs w:val="24"/>
-        </w:rPr>
-        <w:t xml:space="preserve"> </w:t>
-      </w:r>
-      <w:r>
-        <w:rPr>
-          <w:rFonts w:ascii="Times New Roman" w:hAnsi="Times New Roman" w:cs="Times New Roman"/>
-          <w:color w:val="000000"/>
-          <w:sz w:val="24"/>
-          <w:szCs w:val="24"/>
-        </w:rPr>
-        <w:t xml:space="preserve">                </w:t>
-      </w:r>
-      <w:r>
-        <w:rPr>
-          <w:rFonts w:ascii="Times New Roman" w:hAnsi="Times New Roman" w:cs="Times New Roman"/>
-          <w:color w:val="000000"/>
-          <w:sz w:val="24"/>
-          <w:szCs w:val="24"/>
-        </w:rPr>
-        <w:t xml:space="preserve"> </w:t>
-      </w:r>
       <w:r>
         <w:rPr>
           <w:rFonts w:ascii="Times New Roman" w:hAnsi="Times New Roman" w:cs="Times New Roman"/>
@@ -1410,9 +1748,8 @@
           <w:sz w:val="18"/>
           <w:szCs w:val="18"/>
         </w:rPr>
-        <w:t>(</w:t>
-      </w:r>
-      <w:proofErr w:type="gramStart"/>
+        <w:t xml:space="preserve"/>
+      </w:r>
       <w:r>
         <w:rPr>
           <w:rFonts w:ascii="Times New Roman" w:hAnsi="Times New Roman" w:cs="Times New Roman"/>
@@ -1420,7 +1757,7 @@
           <w:sz w:val="18"/>
           <w:szCs w:val="18"/>
         </w:rPr>
-        <w:t>ФИО)</w:t>
+        <w:tab/>
       </w:r>
       <w:r>
         <w:rPr>
@@ -1429,9 +1766,8 @@
           <w:sz w:val="18"/>
           <w:szCs w:val="18"/>
         </w:rPr>
-        <w:t xml:space="preserve">   </w:t>
-      </w:r>
-      <w:proofErr w:type="gramEnd"/>
+        <w:t xml:space="preserve">(подпись)</w:t>
+      </w:r>
       <w:r>
         <w:rPr>
           <w:rFonts w:ascii="Times New Roman" w:hAnsi="Times New Roman" w:cs="Times New Roman"/>
@@ -1439,9 +1775,8 @@
           <w:sz w:val="18"/>
           <w:szCs w:val="18"/>
         </w:rPr>
-        <w:t xml:space="preserve">                                </w:t>
-      </w:r>
-      <w:proofErr w:type="gramStart"/>
+        <w:tab/>
+      </w:r>
       <w:r>
         <w:rPr>
           <w:rFonts w:ascii="Times New Roman" w:hAnsi="Times New Roman" w:cs="Times New Roman"/>
@@ -1449,149 +1784,7 @@
           <w:sz w:val="18"/>
           <w:szCs w:val="18"/>
         </w:rPr>
-        <w:t xml:space="preserve">   </w:t>
-      </w:r>
-      <w:r>
-        <w:rPr>
-          <w:rFonts w:ascii="Times New Roman" w:hAnsi="Times New Roman" w:cs="Times New Roman"/>
-          <w:color w:val="000000"/>
-          <w:sz w:val="18"/>
-          <w:szCs w:val="18"/>
-        </w:rPr>
-        <w:t>(</w:t>
-      </w:r>
-      <w:proofErr w:type="gramEnd"/>
-      <w:r>
-        <w:rPr>
-          <w:rFonts w:ascii="Times New Roman" w:hAnsi="Times New Roman" w:cs="Times New Roman"/>
-          <w:color w:val="000000"/>
-          <w:sz w:val="18"/>
-          <w:szCs w:val="18"/>
-        </w:rPr>
-        <w:t>подпись</w:t>
-      </w:r>
-      <w:r>
-        <w:rPr>
-          <w:rFonts w:ascii="Times New Roman" w:hAnsi="Times New Roman" w:cs="Times New Roman"/>
-          <w:color w:val="000000"/>
-          <w:sz w:val="24"/>
-          <w:szCs w:val="24"/>
-        </w:rPr>
-        <w:t xml:space="preserve">)   </w:t>
-      </w:r>
-      <w:r>
-        <w:rPr>
-          <w:rFonts w:ascii="Times New Roman" w:hAnsi="Times New Roman" w:cs="Times New Roman"/>
-          <w:color w:val="000000"/>
-          <w:sz w:val="24"/>
-          <w:szCs w:val="24"/>
-        </w:rPr>
-        <w:t xml:space="preserve">                                           </w:t>
-      </w:r>
-      <w:r>
-        <w:rPr>
-          <w:rFonts w:ascii="Times New Roman" w:hAnsi="Times New Roman" w:cs="Times New Roman"/>
-          <w:color w:val="000000"/>
-          <w:sz w:val="24"/>
-          <w:szCs w:val="24"/>
-        </w:rPr>
-        <w:t xml:space="preserve">   </w:t>
-      </w:r>
-    </w:p>
-    <w:p>
-      <w:pPr>
-        <w:pStyle w:val="HTML"/>
-        <w:shd w:val="clear" w:color="auto" w:fill="FFFFFF"/>
-        <w:spacing w:line="276" w:lineRule="auto"/>
-        <w:ind w:left="-993"/>
-        <w:rPr>
-          <w:rFonts w:ascii="Times New Roman" w:hAnsi="Times New Roman" w:cs="Times New Roman"/>
-          <w:color w:val="000000"/>
-          <w:sz w:val="24"/>
-          <w:szCs w:val="24"/>
-        </w:rPr>
-      </w:pPr>
-    </w:p>
-    <w:p>
-      <w:pPr>
-        <w:pStyle w:val="HTML"/>
-        <w:shd w:val="clear" w:color="auto" w:fill="FFFFFF"/>
-        <w:spacing w:line="276" w:lineRule="auto"/>
-        <w:ind w:left="-993"/>
-        <w:rPr>
-          <w:rFonts w:ascii="Times New Roman" w:hAnsi="Times New Roman" w:cs="Times New Roman"/>
-          <w:color w:val="000000"/>
-          <w:sz w:val="24"/>
-          <w:szCs w:val="24"/>
-        </w:rPr>
-      </w:pPr>
-      <w:r>
-        <w:rPr>
-          <w:rFonts w:ascii="Times New Roman" w:hAnsi="Times New Roman" w:cs="Times New Roman"/>
-          <w:color w:val="000000"/>
-          <w:sz w:val="24"/>
-          <w:szCs w:val="24"/>
-        </w:rPr>
-        <w:t xml:space="preserve">[[SIGNATORY_POSITION]] __________________________ / [[SIGNATORY_SHORT]] /</w:t>
-      </w:r>
-      <w:r>
-        <w:rPr>
-          <w:rFonts w:ascii="Times New Roman" w:hAnsi="Times New Roman" w:cs="Times New Roman"/>
-          <w:color w:val="000000"/>
-          <w:sz w:val="24"/>
-          <w:szCs w:val="24"/>
-        </w:rPr>
-        <w:t xml:space="preserve"/>
-      </w:r>
-      <w:r>
-        <w:rPr>
-          <w:rFonts w:ascii="Times New Roman" w:hAnsi="Times New Roman" w:cs="Times New Roman"/>
-          <w:color w:val="000000"/>
-          <w:sz w:val="24"/>
-          <w:szCs w:val="24"/>
-        </w:rPr>
-        <w:t xml:space="preserve"/>
-      </w:r>
-    </w:p>
-    <w:p>
-      <w:pPr>
-        <w:pStyle w:val="HTML"/>
-        <w:shd w:val="clear" w:color="auto" w:fill="FFFFFF"/>
-        <w:spacing w:line="276" w:lineRule="auto"/>
-        <w:ind w:left="-993"/>
-        <w:rPr>
-          <w:rFonts w:ascii="Times New Roman" w:hAnsi="Times New Roman" w:cs="Times New Roman"/>
-          <w:color w:val="000000"/>
-          <w:sz w:val="24"/>
-          <w:szCs w:val="24"/>
-        </w:rPr>
-      </w:pPr>
-      <w:r>
-        <w:rPr>
-          <w:rFonts w:ascii="Times New Roman" w:hAnsi="Times New Roman" w:cs="Times New Roman"/>
-          <w:color w:val="000000"/>
-          <w:sz w:val="18"/>
-          <w:szCs w:val="18"/>
-        </w:rPr>
-        <w:t xml:space="preserve">                                                                                                                                                      </w:t>
-      </w:r>
-      <w:r>
-        <w:rPr>
-          <w:rFonts w:ascii="Times New Roman" w:hAnsi="Times New Roman" w:cs="Times New Roman"/>
-          <w:color w:val="000000"/>
-          <w:sz w:val="18"/>
-          <w:szCs w:val="18"/>
-        </w:rPr>
-        <w:t>(подпись</w:t>
-      </w:r>
-      <w:r>
-        <w:rPr>
-          <w:rFonts w:ascii="Times New Roman" w:hAnsi="Times New Roman" w:cs="Times New Roman"/>
-          <w:color w:val="000000"/>
-          <w:sz w:val="24"/>
-          <w:szCs w:val="24"/>
-        </w:rPr>
-        <w:t xml:space="preserve">)                                                 </w:t>
+        <w:t xml:space="preserve">(ФИО)</w:t>
       </w:r>
     </w:p>
     <w:p>

</xml_diff>

<commit_message>
fix(goreltech): harden student group preflight and readable document layout
</commit_message>
<xml_diff>
--- a/supabase/functions/_shared/group-doc-templates/goreltech/group-package/v1/templates/attestation_sheet.docx
+++ b/supabase/functions/_shared/group-doc-templates/goreltech/group-package/v1/templates/attestation_sheet.docx
@@ -1230,6 +1230,342 @@
           <w:szCs w:val="24"/>
         </w:rPr>
       </w:pPr>
+    </w:p>
+    <w:p>
+      <w:pPr>
+        <w:pStyle w:val="HTML"/>
+        <w:shd w:val="clear" w:color="auto" w:fill="FFFFFF"/>
+        <w:spacing w:line="276" w:lineRule="auto"/>
+        <w:ind w:left="-993"/>
+        <w:rPr>
+          <w:rFonts w:ascii="Times New Roman" w:hAnsi="Times New Roman" w:cs="Times New Roman"/>
+          <w:color w:val="000000"/>
+          <w:sz w:val="24"/>
+          <w:szCs w:val="24"/>
+        </w:rPr>
+      </w:pPr>
+    </w:p>
+    <w:p>
+      <w:pPr>
+        <w:pStyle w:val="HTML"/>
+        <w:keepNext/>
+        <w:shd w:val="clear" w:color="auto" w:fill="FFFFFF"/>
+        <w:tabs>
+          <w:tab w:val="clear" w:pos="916"/>
+          <w:tab w:val="clear" w:pos="1832"/>
+          <w:tab w:val="clear" w:pos="2748"/>
+          <w:tab w:val="clear" w:pos="3664"/>
+          <w:tab w:val="clear" w:pos="4580"/>
+          <w:tab w:val="center" w:pos="4800"/>
+          <w:tab w:val="clear" w:pos="5496"/>
+          <w:tab w:val="clear" w:pos="6412"/>
+          <w:tab w:val="clear" w:pos="7328"/>
+          <w:tab w:val="center" w:pos="7600"/>
+          <w:tab w:val="clear" w:pos="8244"/>
+          <w:tab w:val="clear" w:pos="9160"/>
+          <w:tab w:val="clear" w:pos="10076"/>
+          <w:tab w:val="clear" w:pos="10992"/>
+          <w:tab w:val="clear" w:pos="11908"/>
+          <w:tab w:val="clear" w:pos="12824"/>
+          <w:tab w:val="clear" w:pos="13740"/>
+          <w:tab w:val="clear" w:pos="14656"/>
+        </w:tabs>
+        <w:spacing w:line="276" w:lineRule="auto"/>
+        <w:ind w:left="7600" w:right="0" w:hanging="7600" w:leftChars="0" w:rightChars="0" w:hangingChars="0"/>
+        <w:jc w:val="left"/>
+        <w:rPr>
+          <w:rFonts w:ascii="Times New Roman" w:hAnsi="Times New Roman" w:cs="Times New Roman"/>
+          <w:color w:val="000000"/>
+          <w:sz w:val="24"/>
+          <w:szCs w:val="24"/>
+        </w:rPr>
+      </w:pPr>
+      <w:r>
+        <w:rPr>
+          <w:rFonts w:ascii="Times New Roman" w:hAnsi="Times New Roman" w:cs="Times New Roman"/>
+          <w:color w:val="000000"/>
+          <w:sz w:val="24"/>
+          <w:szCs w:val="24"/>
+        </w:rPr>
+        <w:t xml:space="preserve">Подпись преподавателя 1</w:t>
+      </w:r>
+      <w:r>
+        <w:rPr>
+          <w:rFonts w:ascii="Times New Roman" w:hAnsi="Times New Roman" w:cs="Times New Roman"/>
+          <w:color w:val="000000"/>
+          <w:sz w:val="24"/>
+          <w:szCs w:val="24"/>
+        </w:rPr>
+        <w:tab/>
+      </w:r>
+      <w:r>
+        <w:rPr>
+          <w:rFonts w:ascii="Times New Roman" w:hAnsi="Times New Roman" w:cs="Times New Roman"/>
+          <w:color w:val="000000"/>
+          <w:sz w:val="24"/>
+          <w:szCs w:val="24"/>
+        </w:rPr>
+        <w:t xml:space="preserve">__________________________</w:t>
+      </w:r>
+      <w:r>
+        <w:rPr>
+          <w:rFonts w:ascii="Times New Roman" w:hAnsi="Times New Roman" w:cs="Times New Roman"/>
+          <w:color w:val="000000"/>
+          <w:sz w:val="24"/>
+          <w:szCs w:val="24"/>
+        </w:rPr>
+        <w:tab/>
+      </w:r>
+      <w:r>
+        <w:rPr>
+          <w:rFonts w:ascii="Times New Roman" w:hAnsi="Times New Roman" w:cs="Times New Roman"/>
+          <w:color w:val="000000"/>
+          <w:sz w:val="24"/>
+          <w:szCs w:val="24"/>
+        </w:rPr>
+        <w:t xml:space="preserve">[[INSTRUCTOR_1_SHORT]]</w:t>
+      </w:r>
+    </w:p>
+    <w:p>
+      <w:pPr>
+        <w:pStyle w:val="HTML"/>
+        <w:shd w:val="clear" w:color="auto" w:fill="FFFFFF"/>
+        <w:tabs>
+          <w:tab w:val="clear" w:pos="916"/>
+          <w:tab w:val="clear" w:pos="1832"/>
+          <w:tab w:val="clear" w:pos="2748"/>
+          <w:tab w:val="clear" w:pos="3664"/>
+          <w:tab w:val="clear" w:pos="4580"/>
+          <w:tab w:val="center" w:pos="4800"/>
+          <w:tab w:val="clear" w:pos="5496"/>
+          <w:tab w:val="clear" w:pos="6412"/>
+          <w:tab w:val="clear" w:pos="7328"/>
+          <w:tab w:val="center" w:pos="7600"/>
+          <w:tab w:val="clear" w:pos="8244"/>
+          <w:tab w:val="clear" w:pos="9160"/>
+          <w:tab w:val="clear" w:pos="10076"/>
+          <w:tab w:val="clear" w:pos="10992"/>
+          <w:tab w:val="clear" w:pos="11908"/>
+          <w:tab w:val="clear" w:pos="12824"/>
+          <w:tab w:val="clear" w:pos="13740"/>
+          <w:tab w:val="clear" w:pos="14656"/>
+        </w:tabs>
+        <w:spacing w:line="276" w:lineRule="auto"/>
+        <w:ind w:left="0" w:right="0" w:firstLine="0" w:hanging="0" w:leftChars="0" w:rightChars="0" w:firstLineChars="0" w:hangingChars="0"/>
+        <w:jc w:val="left"/>
+        <w:rPr>
+          <w:rFonts w:ascii="Times New Roman" w:hAnsi="Times New Roman" w:cs="Times New Roman"/>
+          <w:color w:val="000000"/>
+          <w:sz w:val="24"/>
+          <w:szCs w:val="24"/>
+        </w:rPr>
+      </w:pPr>
+      <w:r>
+        <w:rPr>
+          <w:rFonts w:ascii="Times New Roman" w:hAnsi="Times New Roman" w:cs="Times New Roman"/>
+          <w:color w:val="000000"/>
+          <w:sz w:val="24"/>
+          <w:szCs w:val="24"/>
+        </w:rPr>
+        <w:t xml:space="preserve"/>
+      </w:r>
+      <w:r>
+        <w:rPr>
+          <w:rFonts w:ascii="Times New Roman" w:hAnsi="Times New Roman" w:cs="Times New Roman"/>
+          <w:color w:val="000000"/>
+          <w:sz w:val="24"/>
+          <w:szCs w:val="24"/>
+        </w:rPr>
+        <w:tab/>
+      </w:r>
+      <w:r>
+        <w:rPr>
+          <w:rFonts w:ascii="Times New Roman" w:hAnsi="Times New Roman" w:cs="Times New Roman"/>
+          <w:color w:val="000000"/>
+          <w:sz w:val="24"/>
+          <w:szCs w:val="24"/>
+        </w:rPr>
+        <w:t xml:space="preserve">(подпись)</w:t>
+      </w:r>
+      <w:r>
+        <w:rPr>
+          <w:rFonts w:ascii="Times New Roman" w:hAnsi="Times New Roman" w:cs="Times New Roman"/>
+          <w:color w:val="000000"/>
+          <w:sz w:val="24"/>
+          <w:szCs w:val="24"/>
+        </w:rPr>
+        <w:tab/>
+      </w:r>
+      <w:r>
+        <w:rPr>
+          <w:rFonts w:ascii="Times New Roman" w:hAnsi="Times New Roman" w:cs="Times New Roman"/>
+          <w:color w:val="000000"/>
+          <w:sz w:val="24"/>
+          <w:szCs w:val="24"/>
+        </w:rPr>
+        <w:t xml:space="preserve">(ФИО)</w:t>
+      </w:r>
+    </w:p>
+    <w:p>
+      <w:pPr>
+        <w:pStyle w:val="HTML"/>
+        <w:keepNext/>
+        <w:shd w:val="clear" w:color="auto" w:fill="FFFFFF"/>
+        <w:tabs>
+          <w:tab w:val="clear" w:pos="916"/>
+          <w:tab w:val="clear" w:pos="1832"/>
+          <w:tab w:val="clear" w:pos="2748"/>
+          <w:tab w:val="clear" w:pos="3664"/>
+          <w:tab w:val="clear" w:pos="4580"/>
+          <w:tab w:val="center" w:pos="4800"/>
+          <w:tab w:val="clear" w:pos="5496"/>
+          <w:tab w:val="clear" w:pos="6412"/>
+          <w:tab w:val="clear" w:pos="7328"/>
+          <w:tab w:val="center" w:pos="7600"/>
+          <w:tab w:val="clear" w:pos="8244"/>
+          <w:tab w:val="clear" w:pos="9160"/>
+          <w:tab w:val="clear" w:pos="10076"/>
+          <w:tab w:val="clear" w:pos="10992"/>
+          <w:tab w:val="clear" w:pos="11908"/>
+          <w:tab w:val="clear" w:pos="12824"/>
+          <w:tab w:val="clear" w:pos="13740"/>
+          <w:tab w:val="clear" w:pos="14656"/>
+        </w:tabs>
+        <w:spacing w:line="276" w:lineRule="auto"/>
+        <w:ind w:left="7600" w:right="0" w:hanging="7600" w:leftChars="0" w:rightChars="0" w:hangingChars="0"/>
+        <w:jc w:val="left"/>
+        <w:rPr>
+          <w:rFonts w:ascii="Times New Roman" w:hAnsi="Times New Roman" w:cs="Times New Roman"/>
+          <w:color w:val="000000"/>
+          <w:sz w:val="24"/>
+          <w:szCs w:val="24"/>
+        </w:rPr>
+      </w:pPr>
+      <w:r>
+        <w:rPr>
+          <w:rFonts w:ascii="Times New Roman" w:hAnsi="Times New Roman" w:cs="Times New Roman"/>
+          <w:color w:val="000000"/>
+          <w:sz w:val="24"/>
+          <w:szCs w:val="24"/>
+        </w:rPr>
+        <w:t xml:space="preserve">Подпись преподавателя 2</w:t>
+      </w:r>
+      <w:r>
+        <w:rPr>
+          <w:rFonts w:ascii="Times New Roman" w:hAnsi="Times New Roman" w:cs="Times New Roman"/>
+          <w:color w:val="000000"/>
+          <w:sz w:val="24"/>
+          <w:szCs w:val="24"/>
+        </w:rPr>
+        <w:tab/>
+      </w:r>
+      <w:r>
+        <w:rPr>
+          <w:rFonts w:ascii="Times New Roman" w:hAnsi="Times New Roman" w:cs="Times New Roman"/>
+          <w:color w:val="000000"/>
+          <w:sz w:val="24"/>
+          <w:szCs w:val="24"/>
+        </w:rPr>
+        <w:t xml:space="preserve">__________________________</w:t>
+      </w:r>
+      <w:r>
+        <w:rPr>
+          <w:rFonts w:ascii="Times New Roman" w:hAnsi="Times New Roman" w:cs="Times New Roman"/>
+          <w:color w:val="000000"/>
+          <w:sz w:val="24"/>
+          <w:szCs w:val="24"/>
+        </w:rPr>
+        <w:tab/>
+      </w:r>
+      <w:r>
+        <w:rPr>
+          <w:rFonts w:ascii="Times New Roman" w:hAnsi="Times New Roman" w:cs="Times New Roman"/>
+          <w:color w:val="000000"/>
+          <w:sz w:val="24"/>
+          <w:szCs w:val="24"/>
+        </w:rPr>
+        <w:t xml:space="preserve">[[INSTRUCTOR_2_SHORT]]</w:t>
+      </w:r>
+    </w:p>
+    <w:p>
+      <w:pPr>
+        <w:pStyle w:val="HTML"/>
+        <w:shd w:val="clear" w:color="auto" w:fill="FFFFFF"/>
+        <w:tabs>
+          <w:tab w:val="clear" w:pos="916"/>
+          <w:tab w:val="clear" w:pos="1832"/>
+          <w:tab w:val="clear" w:pos="2748"/>
+          <w:tab w:val="clear" w:pos="3664"/>
+          <w:tab w:val="clear" w:pos="4580"/>
+          <w:tab w:val="center" w:pos="4800"/>
+          <w:tab w:val="clear" w:pos="5496"/>
+          <w:tab w:val="clear" w:pos="6412"/>
+          <w:tab w:val="clear" w:pos="7328"/>
+          <w:tab w:val="center" w:pos="7600"/>
+          <w:tab w:val="clear" w:pos="8244"/>
+          <w:tab w:val="clear" w:pos="9160"/>
+          <w:tab w:val="clear" w:pos="10076"/>
+          <w:tab w:val="clear" w:pos="10992"/>
+          <w:tab w:val="clear" w:pos="11908"/>
+          <w:tab w:val="clear" w:pos="12824"/>
+          <w:tab w:val="clear" w:pos="13740"/>
+          <w:tab w:val="clear" w:pos="14656"/>
+        </w:tabs>
+        <w:spacing w:line="276" w:lineRule="auto"/>
+        <w:ind w:left="0" w:right="0" w:firstLine="0" w:hanging="0" w:leftChars="0" w:rightChars="0" w:firstLineChars="0" w:hangingChars="0"/>
+        <w:jc w:val="left"/>
+        <w:rPr>
+          <w:rFonts w:ascii="Times New Roman" w:hAnsi="Times New Roman" w:cs="Times New Roman"/>
+          <w:color w:val="000000"/>
+          <w:sz w:val="24"/>
+          <w:szCs w:val="24"/>
+        </w:rPr>
+      </w:pPr>
+      <w:r>
+        <w:rPr>
+          <w:rFonts w:ascii="Times New Roman" w:hAnsi="Times New Roman" w:cs="Times New Roman"/>
+          <w:color w:val="000000"/>
+          <w:sz w:val="24"/>
+          <w:szCs w:val="24"/>
+        </w:rPr>
+        <w:t xml:space="preserve"/>
+      </w:r>
+      <w:r>
+        <w:rPr>
+          <w:rFonts w:ascii="Times New Roman" w:hAnsi="Times New Roman" w:cs="Times New Roman"/>
+          <w:color w:val="000000"/>
+          <w:sz w:val="24"/>
+          <w:szCs w:val="24"/>
+        </w:rPr>
+        <w:tab/>
+      </w:r>
+      <w:r>
+        <w:rPr>
+          <w:rFonts w:ascii="Times New Roman" w:hAnsi="Times New Roman" w:cs="Times New Roman"/>
+          <w:color w:val="000000"/>
+          <w:sz w:val="24"/>
+          <w:szCs w:val="24"/>
+        </w:rPr>
+        <w:t xml:space="preserve">(подпись)</w:t>
+      </w:r>
+      <w:r>
+        <w:rPr>
+          <w:rFonts w:ascii="Times New Roman" w:hAnsi="Times New Roman" w:cs="Times New Roman"/>
+          <w:color w:val="000000"/>
+          <w:sz w:val="24"/>
+          <w:szCs w:val="24"/>
+        </w:rPr>
+        <w:tab/>
+      </w:r>
+      <w:r>
+        <w:rPr>
+          <w:rFonts w:ascii="Times New Roman" w:hAnsi="Times New Roman" w:cs="Times New Roman"/>
+          <w:color w:val="000000"/>
+          <w:sz w:val="24"/>
+          <w:szCs w:val="24"/>
+        </w:rPr>
+        <w:t xml:space="preserve">(ФИО)</w:t>
+      </w:r>
     </w:p>
     <w:p>
       <w:pPr>
@@ -1287,123 +1623,7 @@
           <w:sz w:val="24"/>
           <w:szCs w:val="24"/>
         </w:rPr>
-        <w:t xml:space="preserve">Подпись преподавателя 1</w:t>
-      </w:r>
-      <w:r>
-        <w:rPr>
-          <w:rFonts w:ascii="Times New Roman" w:hAnsi="Times New Roman" w:cs="Times New Roman"/>
-          <w:color w:val="000000"/>
-          <w:sz w:val="24"/>
-          <w:szCs w:val="24"/>
-        </w:rPr>
-        <w:tab/>
-      </w:r>
-      <w:r>
-        <w:rPr>
-          <w:rFonts w:ascii="Times New Roman" w:hAnsi="Times New Roman" w:cs="Times New Roman"/>
-          <w:color w:val="000000"/>
-          <w:sz w:val="24"/>
-          <w:szCs w:val="24"/>
-        </w:rPr>
-        <w:t xml:space="preserve">__________________________</w:t>
-      </w:r>
-      <w:r>
-        <w:rPr>
-          <w:rFonts w:ascii="Times New Roman" w:hAnsi="Times New Roman" w:cs="Times New Roman"/>
-          <w:color w:val="000000"/>
-          <w:sz w:val="24"/>
-          <w:szCs w:val="24"/>
-        </w:rPr>
-        <w:tab/>
-      </w:r>
-      <w:r>
-        <w:rPr>
-          <w:rFonts w:ascii="Times New Roman" w:hAnsi="Times New Roman" w:cs="Times New Roman"/>
-          <w:color w:val="000000"/>
-          <w:sz w:val="24"/>
-          <w:szCs w:val="24"/>
-        </w:rPr>
-        <w:t xml:space="preserve">[[INSTRUCTOR_1_SHORT]]</w:t>
-      </w:r>
-    </w:p>
-    <w:p>
-      <w:pPr>
-        <w:pStyle w:val="HTML"/>
-        <w:shd w:val="clear" w:color="auto" w:fill="FFFFFF"/>
-        <w:tabs>
-          <w:tab w:val="clear" w:pos="916"/>
-          <w:tab w:val="clear" w:pos="1832"/>
-          <w:tab w:val="clear" w:pos="2748"/>
-          <w:tab w:val="clear" w:pos="3664"/>
-          <w:tab w:val="clear" w:pos="4580"/>
-          <w:tab w:val="center" w:pos="4800"/>
-          <w:tab w:val="clear" w:pos="5496"/>
-          <w:tab w:val="clear" w:pos="6412"/>
-          <w:tab w:val="clear" w:pos="7328"/>
-          <w:tab w:val="center" w:pos="7600"/>
-          <w:tab w:val="clear" w:pos="8244"/>
-          <w:tab w:val="clear" w:pos="9160"/>
-          <w:tab w:val="clear" w:pos="10076"/>
-          <w:tab w:val="clear" w:pos="10992"/>
-          <w:tab w:val="clear" w:pos="11908"/>
-          <w:tab w:val="clear" w:pos="12824"/>
-          <w:tab w:val="clear" w:pos="13740"/>
-          <w:tab w:val="clear" w:pos="14656"/>
-        </w:tabs>
-        <w:spacing w:line="276" w:lineRule="auto"/>
-        <w:ind w:left="0" w:right="0" w:firstLine="0" w:hanging="0" w:leftChars="0" w:rightChars="0" w:firstLineChars="0" w:hangingChars="0"/>
-        <w:jc w:val="left"/>
-        <w:rPr>
-          <w:rFonts w:ascii="Times New Roman" w:hAnsi="Times New Roman" w:cs="Times New Roman"/>
-          <w:color w:val="000000"/>
-          <w:sz w:val="24"/>
-          <w:szCs w:val="24"/>
-        </w:rPr>
-      </w:pPr>
-      <w:r>
-        <w:rPr>
-          <w:rFonts w:ascii="Times New Roman" w:hAnsi="Times New Roman" w:cs="Times New Roman"/>
-          <w:color w:val="000000"/>
-          <w:sz w:val="24"/>
-          <w:szCs w:val="24"/>
-        </w:rPr>
-        <w:t xml:space="preserve"/>
-      </w:r>
-      <w:r>
-        <w:rPr>
-          <w:rFonts w:ascii="Times New Roman" w:hAnsi="Times New Roman" w:cs="Times New Roman"/>
-          <w:color w:val="000000"/>
-          <w:sz w:val="24"/>
-          <w:szCs w:val="24"/>
-        </w:rPr>
-        <w:tab/>
-      </w:r>
-      <w:r>
-        <w:rPr>
-          <w:rFonts w:ascii="Times New Roman" w:hAnsi="Times New Roman" w:cs="Times New Roman"/>
-          <w:color w:val="000000"/>
-          <w:sz w:val="24"/>
-          <w:szCs w:val="24"/>
-        </w:rPr>
-        <w:t xml:space="preserve">(подпись)</w:t>
-      </w:r>
-      <w:r>
-        <w:rPr>
-          <w:rFonts w:ascii="Times New Roman" w:hAnsi="Times New Roman" w:cs="Times New Roman"/>
-          <w:color w:val="000000"/>
-          <w:sz w:val="24"/>
-          <w:szCs w:val="24"/>
-        </w:rPr>
-        <w:tab/>
-      </w:r>
-      <w:r>
-        <w:rPr>
-          <w:rFonts w:ascii="Times New Roman" w:hAnsi="Times New Roman" w:cs="Times New Roman"/>
-          <w:color w:val="000000"/>
-          <w:sz w:val="24"/>
-          <w:szCs w:val="24"/>
-        </w:rPr>
-        <w:t xml:space="preserve">(ФИО)</w:t>
+        <w:t xml:space="preserve">[[SIGNATORY_POSITION]]</w:t>
       </w:r>
     </w:p>
     <w:p>
@@ -1432,227 +1652,7 @@
           <w:tab w:val="clear" w:pos="14656"/>
         </w:tabs>
         <w:spacing w:line="276" w:lineRule="auto"/>
-        <w:ind w:left="0" w:right="0" w:firstLine="0" w:hanging="0" w:leftChars="0" w:rightChars="0" w:firstLineChars="0" w:hangingChars="0"/>
-        <w:jc w:val="left"/>
-        <w:rPr>
-          <w:rFonts w:ascii="Times New Roman" w:hAnsi="Times New Roman" w:cs="Times New Roman"/>
-          <w:color w:val="000000"/>
-          <w:sz w:val="24"/>
-          <w:szCs w:val="24"/>
-        </w:rPr>
-      </w:pPr>
-      <w:r>
-        <w:rPr>
-          <w:rFonts w:ascii="Times New Roman" w:hAnsi="Times New Roman" w:cs="Times New Roman"/>
-          <w:color w:val="000000"/>
-          <w:sz w:val="24"/>
-          <w:szCs w:val="24"/>
-        </w:rPr>
-        <w:t xml:space="preserve">Подпись преподавателя 2</w:t>
-      </w:r>
-      <w:r>
-        <w:rPr>
-          <w:rFonts w:ascii="Times New Roman" w:hAnsi="Times New Roman" w:cs="Times New Roman"/>
-          <w:color w:val="000000"/>
-          <w:sz w:val="24"/>
-          <w:szCs w:val="24"/>
-        </w:rPr>
-        <w:tab/>
-      </w:r>
-      <w:r>
-        <w:rPr>
-          <w:rFonts w:ascii="Times New Roman" w:hAnsi="Times New Roman" w:cs="Times New Roman"/>
-          <w:color w:val="000000"/>
-          <w:sz w:val="24"/>
-          <w:szCs w:val="24"/>
-        </w:rPr>
-        <w:t xml:space="preserve">__________________________</w:t>
-      </w:r>
-      <w:r>
-        <w:rPr>
-          <w:rFonts w:ascii="Times New Roman" w:hAnsi="Times New Roman" w:cs="Times New Roman"/>
-          <w:color w:val="000000"/>
-          <w:sz w:val="24"/>
-          <w:szCs w:val="24"/>
-        </w:rPr>
-        <w:tab/>
-      </w:r>
-      <w:r>
-        <w:rPr>
-          <w:rFonts w:ascii="Times New Roman" w:hAnsi="Times New Roman" w:cs="Times New Roman"/>
-          <w:color w:val="000000"/>
-          <w:sz w:val="24"/>
-          <w:szCs w:val="24"/>
-        </w:rPr>
-        <w:t xml:space="preserve">[[INSTRUCTOR_2_SHORT]]</w:t>
-      </w:r>
-    </w:p>
-    <w:p>
-      <w:pPr>
-        <w:pStyle w:val="HTML"/>
-        <w:shd w:val="clear" w:color="auto" w:fill="FFFFFF"/>
-        <w:tabs>
-          <w:tab w:val="clear" w:pos="916"/>
-          <w:tab w:val="clear" w:pos="1832"/>
-          <w:tab w:val="clear" w:pos="2748"/>
-          <w:tab w:val="clear" w:pos="3664"/>
-          <w:tab w:val="clear" w:pos="4580"/>
-          <w:tab w:val="center" w:pos="4800"/>
-          <w:tab w:val="clear" w:pos="5496"/>
-          <w:tab w:val="clear" w:pos="6412"/>
-          <w:tab w:val="clear" w:pos="7328"/>
-          <w:tab w:val="center" w:pos="7600"/>
-          <w:tab w:val="clear" w:pos="8244"/>
-          <w:tab w:val="clear" w:pos="9160"/>
-          <w:tab w:val="clear" w:pos="10076"/>
-          <w:tab w:val="clear" w:pos="10992"/>
-          <w:tab w:val="clear" w:pos="11908"/>
-          <w:tab w:val="clear" w:pos="12824"/>
-          <w:tab w:val="clear" w:pos="13740"/>
-          <w:tab w:val="clear" w:pos="14656"/>
-        </w:tabs>
-        <w:spacing w:line="276" w:lineRule="auto"/>
-        <w:ind w:left="0" w:right="0" w:firstLine="0" w:hanging="0" w:leftChars="0" w:rightChars="0" w:firstLineChars="0" w:hangingChars="0"/>
-        <w:jc w:val="left"/>
-        <w:rPr>
-          <w:rFonts w:ascii="Times New Roman" w:hAnsi="Times New Roman" w:cs="Times New Roman"/>
-          <w:color w:val="000000"/>
-          <w:sz w:val="24"/>
-          <w:szCs w:val="24"/>
-        </w:rPr>
-      </w:pPr>
-      <w:r>
-        <w:rPr>
-          <w:rFonts w:ascii="Times New Roman" w:hAnsi="Times New Roman" w:cs="Times New Roman"/>
-          <w:color w:val="000000"/>
-          <w:sz w:val="24"/>
-          <w:szCs w:val="24"/>
-        </w:rPr>
-        <w:t xml:space="preserve"/>
-      </w:r>
-      <w:r>
-        <w:rPr>
-          <w:rFonts w:ascii="Times New Roman" w:hAnsi="Times New Roman" w:cs="Times New Roman"/>
-          <w:color w:val="000000"/>
-          <w:sz w:val="24"/>
-          <w:szCs w:val="24"/>
-        </w:rPr>
-        <w:tab/>
-      </w:r>
-      <w:r>
-        <w:rPr>
-          <w:rFonts w:ascii="Times New Roman" w:hAnsi="Times New Roman" w:cs="Times New Roman"/>
-          <w:color w:val="000000"/>
-          <w:sz w:val="24"/>
-          <w:szCs w:val="24"/>
-        </w:rPr>
-        <w:t xml:space="preserve">(подпись)</w:t>
-      </w:r>
-      <w:r>
-        <w:rPr>
-          <w:rFonts w:ascii="Times New Roman" w:hAnsi="Times New Roman" w:cs="Times New Roman"/>
-          <w:color w:val="000000"/>
-          <w:sz w:val="24"/>
-          <w:szCs w:val="24"/>
-        </w:rPr>
-        <w:tab/>
-      </w:r>
-      <w:r>
-        <w:rPr>
-          <w:rFonts w:ascii="Times New Roman" w:hAnsi="Times New Roman" w:cs="Times New Roman"/>
-          <w:color w:val="000000"/>
-          <w:sz w:val="24"/>
-          <w:szCs w:val="24"/>
-        </w:rPr>
-        <w:t xml:space="preserve">(ФИО)</w:t>
-      </w:r>
-    </w:p>
-    <w:p>
-      <w:pPr>
-        <w:pStyle w:val="HTML"/>
-        <w:shd w:val="clear" w:color="auto" w:fill="FFFFFF"/>
-        <w:spacing w:line="276" w:lineRule="auto"/>
-        <w:ind w:left="-993"/>
-        <w:rPr>
-          <w:rFonts w:ascii="Times New Roman" w:hAnsi="Times New Roman" w:cs="Times New Roman"/>
-          <w:color w:val="000000"/>
-          <w:sz w:val="24"/>
-          <w:szCs w:val="24"/>
-        </w:rPr>
-      </w:pPr>
-    </w:p>
-    <w:p>
-      <w:pPr>
-        <w:pStyle w:val="HTML"/>
-        <w:keepNext/>
-        <w:shd w:val="clear" w:color="auto" w:fill="FFFFFF"/>
-        <w:tabs>
-          <w:tab w:val="clear" w:pos="916"/>
-          <w:tab w:val="clear" w:pos="1832"/>
-          <w:tab w:val="clear" w:pos="2748"/>
-          <w:tab w:val="clear" w:pos="3664"/>
-          <w:tab w:val="clear" w:pos="4580"/>
-          <w:tab w:val="center" w:pos="4800"/>
-          <w:tab w:val="clear" w:pos="5496"/>
-          <w:tab w:val="clear" w:pos="6412"/>
-          <w:tab w:val="clear" w:pos="7328"/>
-          <w:tab w:val="center" w:pos="7600"/>
-          <w:tab w:val="clear" w:pos="8244"/>
-          <w:tab w:val="clear" w:pos="9160"/>
-          <w:tab w:val="clear" w:pos="10076"/>
-          <w:tab w:val="clear" w:pos="10992"/>
-          <w:tab w:val="clear" w:pos="11908"/>
-          <w:tab w:val="clear" w:pos="12824"/>
-          <w:tab w:val="clear" w:pos="13740"/>
-          <w:tab w:val="clear" w:pos="14656"/>
-        </w:tabs>
-        <w:spacing w:line="276" w:lineRule="auto"/>
-        <w:ind w:left="0" w:right="0" w:firstLine="0" w:hanging="0" w:leftChars="0" w:rightChars="0" w:firstLineChars="0" w:hangingChars="0"/>
-        <w:jc w:val="left"/>
-        <w:rPr>
-          <w:rFonts w:ascii="Times New Roman" w:hAnsi="Times New Roman" w:cs="Times New Roman"/>
-          <w:color w:val="000000"/>
-          <w:sz w:val="24"/>
-          <w:szCs w:val="24"/>
-        </w:rPr>
-      </w:pPr>
-      <w:r>
-        <w:rPr>
-          <w:rFonts w:ascii="Times New Roman" w:hAnsi="Times New Roman" w:cs="Times New Roman"/>
-          <w:color w:val="000000"/>
-          <w:sz w:val="24"/>
-          <w:szCs w:val="24"/>
-        </w:rPr>
-        <w:t xml:space="preserve">[[SIGNATORY_POSITION]]</w:t>
-      </w:r>
-    </w:p>
-    <w:p>
-      <w:pPr>
-        <w:pStyle w:val="HTML"/>
-        <w:keepNext/>
-        <w:shd w:val="clear" w:color="auto" w:fill="FFFFFF"/>
-        <w:tabs>
-          <w:tab w:val="clear" w:pos="916"/>
-          <w:tab w:val="clear" w:pos="1832"/>
-          <w:tab w:val="clear" w:pos="2748"/>
-          <w:tab w:val="clear" w:pos="3664"/>
-          <w:tab w:val="clear" w:pos="4580"/>
-          <w:tab w:val="center" w:pos="4800"/>
-          <w:tab w:val="clear" w:pos="5496"/>
-          <w:tab w:val="clear" w:pos="6412"/>
-          <w:tab w:val="clear" w:pos="7328"/>
-          <w:tab w:val="center" w:pos="7600"/>
-          <w:tab w:val="clear" w:pos="8244"/>
-          <w:tab w:val="clear" w:pos="9160"/>
-          <w:tab w:val="clear" w:pos="10076"/>
-          <w:tab w:val="clear" w:pos="10992"/>
-          <w:tab w:val="clear" w:pos="11908"/>
-          <w:tab w:val="clear" w:pos="12824"/>
-          <w:tab w:val="clear" w:pos="13740"/>
-          <w:tab w:val="clear" w:pos="14656"/>
-        </w:tabs>
-        <w:spacing w:line="276" w:lineRule="auto"/>
-        <w:ind w:left="0" w:right="0" w:firstLine="0" w:hanging="0" w:leftChars="0" w:rightChars="0" w:firstLineChars="0" w:hangingChars="0"/>
+        <w:ind w:left="7600" w:right="0" w:hanging="7600" w:leftChars="0" w:rightChars="0" w:hangingChars="0"/>
         <w:jc w:val="left"/>
         <w:rPr>
           <w:rFonts w:ascii="Times New Roman" w:hAnsi="Times New Roman" w:cs="Times New Roman"/>

</xml_diff>